<commit_message>
Fix Doc 02 cross-reference and soften Document 13 reference
Clause 9.2: the age/vetting explanation referenced from Document 03
lives in an unlabeled callout box before clause 1, not in clause 3
(clause 3.3 there is just the coach's duty to act). Reworded to point
to "the age and vetting note in Document 03" without citing a clause
number that isn't quite right.

Clause 11.3: made Document 13 (Data Processing Terms) apply only
where UniBlueprint has actually provided the Partner a copy of it, so
neither side is bound to an unseen document.

Resynced c-external.js's partner() generator to match, verified via
sandboxed generate-and-diff (0 differences in paragraphs and tables
against the hand-edited .docx).
</commit_message>
<xml_diff>
--- a/contracts/02-Lifestyle-Blueprint-Business-Partner-Agreement.docx
+++ b/contracts/02-Lifestyle-Blueprint-Business-Partner-Agreement.docx
@@ -2367,7 +2367,7 @@
         </w:rPr>
         <w:t>9.2</w:t>
         <w:tab/>
-        <w:t>If the Partner or its personnel become aware, in the course of providing the Offer, that an individual they are dealing with is under the age of 18, the Partner must immediately stop dealing with that individual under the Listing and notify UniBlueprint without delay. UniBlueprint’s membership is intended for members aged 18 and over, though some UniBlueprint services are used by younger students — see the note on this in clause 3 of Document 03, the Uni Coach Agreement, which is the more relevant place for it given the nature of Elevation Blueprint coaching; this clause exists for the same reason, as a safeguard for Lifestyle Blueprint redemptions too.</w:t>
+        <w:t>If the Partner or its personnel become aware, in the course of providing the Offer, that an individual they are dealing with is under the age of 18, the Partner must immediately stop dealing with that individual under the Listing and notify UniBlueprint without delay. UniBlueprint’s membership is intended for members aged 18 and over, though some UniBlueprint services are used by younger students — see the age and vetting note in Document 03, the Uni Coach Agreement, which is the more relevant place for it given the nature of Elevation Blueprint coaching; this clause exists for the same reason, as a safeguard for Lifestyle Blueprint redemptions too.</w:t>
       </w:r>
     </w:p>
     <w:p>
@@ -2507,7 +2507,7 @@
         </w:rPr>
         <w:t>11.3</w:t>
         <w:tab/>
-        <w:t>The Partner will comply with the General Data Protection Regulation (EU) 2016/679 and the Data Protection Act 2018 in respect of all Member personal data it holds, will provide its own privacy notice, and will not use Member data for marketing without a lawful basis. Document 13 (Data Processing Terms) sets out further terms that apply where relevant.</w:t>
+        <w:t>The Partner will comply with the General Data Protection Regulation (EU) 2016/679 and the Data Protection Act 2018 in respect of all Member personal data it holds, will provide its own privacy notice, and will not use Member data for marketing without a lawful basis. Document 13 (Data Processing Terms), where UniBlueprint has provided the Partner with a copy of it, sets out further terms that apply where relevant.</w:t>
       </w:r>
     </w:p>
     <w:p>

</xml_diff>

<commit_message>
Fill Doc 02 Tier reassessment notice and Founding Partner Badge clauses
Clause 4.3: notice period for a Tier reassessment is thirty (30) days,
matching the convention used elsewhere in this document and in the
sibling Coach Agreement.

Clause 4.5: Founding Partner Badge retention is now a settled rule —
the Badge is retained for as long as the Partner maintains a live
Listing, and survives a lapsed/removed Listing only if the Partner
rejoins within six (6) months, mirroring the existing 6-month
reactivation window in clause 3.6.

Resynced c-external.js's partner() function to match, verified via a
sandboxed generate-and-diff against the edited document (0 differences).

Co-Authored-By: Claude Sonnet 5 <noreply@anthropic.com>
Claude-Session: https://claude.ai/code/session_01LmfAhjX3PPhDarULZG6Gos
</commit_message>
<xml_diff>
--- a/contracts/02-Lifestyle-Blueprint-Business-Partner-Agreement.docx
+++ b/contracts/02-Lifestyle-Blueprint-Business-Partner-Agreement.docx
@@ -1817,7 +1817,7 @@
         </w:rPr>
         <w:t>4.3</w:t>
         <w:tab/>
-        <w:t>UniBlueprint may reassess the Partner’s Tier from time to time to reflect changes in the size of the Partner’s business, the scope of its Listing, or its pricing. UniBlueprint will give the Partner [NOTICE PERIOD — TO BE CONFIRMED BY FINANCE] written notice before a change of Tier takes effect.</w:t>
+        <w:t>UniBlueprint may reassess the Partner’s Tier from time to time to reflect changes in the size of the Partner’s business, the scope of its Listing, or its pricing. UniBlueprint will give the Partner thirty (30) days’ written notice before a change of Tier takes effect.</w:t>
       </w:r>
     </w:p>
     <w:p>
@@ -1849,7 +1849,7 @@
         </w:rPr>
         <w:t>4.5</w:t>
         <w:tab/>
-        <w:t>A Partner that signs a Business Partner Agreement before the Public Launch Date is awarded the Founding Partner Badge. The Badge is a timing-based recognition and is independent of the Partner’s Tier or Payment Option. [REVOCABILITY — TO BE CONFIRMED WITH SOLICITOR] governs whether the Badge is retained if the Partner later leaves and rejoins the Platform.</w:t>
+        <w:t>A Partner that signs a Business Partner Agreement before the Public Launch Date is awarded the Founding Partner Badge. The Badge is a timing-based recognition and is independent of the Partner’s Tier or Payment Option. The Badge is retained for as long as the Partner maintains a live Listing on the Platform. If the Listing lapses or is removed and the Partner later rejoins the Platform, the Badge is retained if the Partner rejoins within six (6) months of leaving, and is not retained if the Partner rejoins after that six (6) month period.</w:t>
       </w:r>
     </w:p>
     <w:p>

</xml_diff>